<commit_message>
Lítilsháttar breytingar á dæmi um kröfu í kafla 5
</commit_message>
<xml_diff>
--- a/Verkefni 4/Templates/Áfangi 1 template.docx
+++ b/Verkefni 4/Templates/Áfangi 1 template.docx
@@ -126,19 +126,11 @@
                 <w:b/>
               </w:rPr>
             </w:pPr>
-            <w:proofErr w:type="spellStart"/>
             <w:r>
               <w:rPr>
                 <w:b/>
               </w:rPr>
-              <w:t>Github</w:t>
-            </w:r>
-            <w:proofErr w:type="spellEnd"/>
-            <w:r>
-              <w:rPr>
-                <w:b/>
-              </w:rPr>
-              <w:t xml:space="preserve"> repo </w:t>
+              <w:t xml:space="preserve">Github repo </w:t>
             </w:r>
           </w:p>
         </w:tc>
@@ -709,20 +701,10 @@
       <w:pPr>
         <w:pStyle w:val="Fyrirsgn1"/>
       </w:pPr>
-      <w:proofErr w:type="spellStart"/>
       <w:r>
         <w:lastRenderedPageBreak/>
-        <w:t>Empathy</w:t>
-      </w:r>
-      <w:proofErr w:type="spellEnd"/>
-      <w:r>
-        <w:t xml:space="preserve"> </w:t>
-      </w:r>
-      <w:proofErr w:type="spellStart"/>
-      <w:r>
-        <w:t>Map</w:t>
-      </w:r>
-      <w:proofErr w:type="spellEnd"/>
+        <w:t>Empathy Map</w:t>
+      </w:r>
     </w:p>
     <w:p>
       <w:r>
@@ -908,39 +890,7 @@
                 <w:b/>
                 <w:bCs/>
               </w:rPr>
-              <w:t xml:space="preserve"> (</w:t>
-            </w:r>
-            <w:proofErr w:type="spellStart"/>
-            <w:r>
-              <w:rPr>
-                <w:b/>
-                <w:bCs/>
-              </w:rPr>
-              <w:t>task</w:t>
-            </w:r>
-            <w:proofErr w:type="spellEnd"/>
-            <w:r>
-              <w:rPr>
-                <w:b/>
-                <w:bCs/>
-              </w:rPr>
-              <w:t>/</w:t>
-            </w:r>
-            <w:proofErr w:type="spellStart"/>
-            <w:r>
-              <w:rPr>
-                <w:b/>
-                <w:bCs/>
-              </w:rPr>
-              <w:t>activity</w:t>
-            </w:r>
-            <w:proofErr w:type="spellEnd"/>
-            <w:r>
-              <w:rPr>
-                <w:b/>
-                <w:bCs/>
-              </w:rPr>
-              <w:t xml:space="preserve">) notanda sem hann framkvæmir   </w:t>
+              <w:t xml:space="preserve"> (task/activity) notanda sem hann framkvæmir   </w:t>
             </w:r>
             <w:r>
               <w:rPr>
@@ -1003,7 +953,7 @@
           </w:tcPr>
           <w:p>
             <w:r>
-              <w:t>Bæta við ferð</w:t>
+              <w:t>Notandi skal geta bætt við ferð</w:t>
             </w:r>
           </w:p>
         </w:tc>
@@ -1013,7 +963,25 @@
           </w:tcPr>
           <w:p>
             <w:r>
-              <w:t>Notandi slær inn heiti, áfangastað og dagsetningu og staðfestir</w:t>
+              <w:t xml:space="preserve">Notandi </w:t>
+            </w:r>
+            <w:r>
+              <w:t xml:space="preserve">skal geta slegið </w:t>
+            </w:r>
+            <w:r>
+              <w:t>inn heiti, áfangastað</w:t>
+            </w:r>
+            <w:r>
+              <w:t xml:space="preserve"> og </w:t>
+            </w:r>
+            <w:r>
+              <w:t>dagsetningu og staðfest</w:t>
+            </w:r>
+            <w:r>
+              <w:t>a</w:t>
+            </w:r>
+            <w:r>
+              <w:t>. Kerfið birtir staðfestingu.</w:t>
             </w:r>
           </w:p>
         </w:tc>
@@ -1255,11 +1223,9 @@
       <w:r>
         <w:t xml:space="preserve"> – </w:t>
       </w:r>
-      <w:proofErr w:type="spellStart"/>
       <w:r>
         <w:t>Concepts</w:t>
       </w:r>
-      <w:proofErr w:type="spellEnd"/>
       <w:r>
         <w:t>/Objects</w:t>
       </w:r>
@@ -1396,21 +1362,12 @@
                 <w:bCs/>
               </w:rPr>
             </w:pPr>
-            <w:proofErr w:type="spellStart"/>
             <w:r>
               <w:rPr>
                 <w:b/>
                 <w:bCs/>
               </w:rPr>
-              <w:t>Concepts</w:t>
-            </w:r>
-            <w:proofErr w:type="spellEnd"/>
-            <w:r>
-              <w:rPr>
-                <w:b/>
-                <w:bCs/>
-              </w:rPr>
-              <w:t xml:space="preserve"> / Objects </w:t>
+              <w:t xml:space="preserve">Concepts / Objects </w:t>
             </w:r>
           </w:p>
         </w:tc>
@@ -1769,31 +1726,7 @@
         <w:t xml:space="preserve">ekki </w:t>
       </w:r>
       <w:r>
-        <w:t>notkun hugbúnaðar í samhengi (</w:t>
-      </w:r>
-      <w:proofErr w:type="spellStart"/>
-      <w:r>
-        <w:t>context</w:t>
-      </w:r>
-      <w:proofErr w:type="spellEnd"/>
-      <w:r>
-        <w:t xml:space="preserve">) með sýnilegum notanda. Rammar mega vera </w:t>
-      </w:r>
-      <w:proofErr w:type="spellStart"/>
-      <w:r>
-        <w:t>skissur</w:t>
-      </w:r>
-      <w:proofErr w:type="spellEnd"/>
-      <w:r>
-        <w:t xml:space="preserve"> og mega innihalda </w:t>
-      </w:r>
-      <w:proofErr w:type="spellStart"/>
-      <w:r>
-        <w:t>Wireframes</w:t>
-      </w:r>
-      <w:proofErr w:type="spellEnd"/>
-      <w:r>
-        <w:t xml:space="preserve">. </w:t>
+        <w:t xml:space="preserve">notkun hugbúnaðar í samhengi (context) með sýnilegum notanda. Rammar mega vera skissur og mega innihalda Wireframes. </w:t>
       </w:r>
     </w:p>
     <w:p>
@@ -1910,7 +1843,6 @@
       <w:r>
         <w:t xml:space="preserve">Gerið </w:t>
       </w:r>
-      <w:proofErr w:type="spellStart"/>
       <w:r>
         <w:rPr>
           <w:b/>
@@ -1918,7 +1850,6 @@
         </w:rPr>
         <w:t>skissur</w:t>
       </w:r>
-      <w:proofErr w:type="spellEnd"/>
       <w:r>
         <w:t>.</w:t>
       </w:r>
@@ -4380,6 +4311,7 @@
   <w:style w:type="character" w:default="1" w:styleId="Sjlfgefinleturgermlsgreinar">
     <w:name w:val="Default Paragraph Font"/>
     <w:uiPriority w:val="1"/>
+    <w:semiHidden/>
     <w:unhideWhenUsed/>
   </w:style>
   <w:style w:type="table" w:default="1" w:styleId="Tafla-venjuleg">

</xml_diff>